<commit_message>
Switch build to lualatex with luaotfload font fallback; tidy README revisions
Build engine moves from xelatex to lualatex (LuaHBTeX) so per-glyph font
fallback works natively. build/templates/header.tex registers EB Garamond and
DejaVu Serif as fallback fonts via luaotfload.add_fallback, attached to each
font declaration through fontspec's RawFeature mechanism. Liberation Serif
remains the main font; characters it lacks (U+207B superscript-minus,
U+226A much-less-than) now render through the fallback chain instead of
appearing as gaps. Default Liberation Serif/Sans/Mono settings added to
PANDOC_PDF_FLAGS so .md files without YAML frontmatter pick them up.

README revision-display policy applied: only the latest revision is shown;
"_RevN" suffixes hidden from section titles and subtitles; "(Revision N)"
appended to the section heading instead. Older revision binaries remain on
disk for internal reference but are no longer linked.
</commit_message>
<xml_diff>
--- a/dist/12hz-power-grid/12Hz_AC_vs_DC_Grid_Technical_Annex_Rev10.docx
+++ b/dist/12hz-power-grid/12Hz_AC_vs_DC_Grid_Technical_Annex_Rev10.docx
@@ -7,55 +7,7 @@
         <w:pStyle w:val="Title"/>
       </w:pPr>
       <w:r>
-        <w:t xml:space="preserve">Technical</w:t>
-      </w:r>
-      <w:r>
-        <w:t xml:space="preserve"> </w:t>
-      </w:r>
-      <w:r>
-        <w:t xml:space="preserve">Annex:</w:t>
-      </w:r>
-      <w:r>
-        <w:t xml:space="preserve"> </w:t>
-      </w:r>
-      <w:r>
-        <w:t xml:space="preserve">12</w:t>
-      </w:r>
-      <w:r>
-        <w:t xml:space="preserve"> </w:t>
-      </w:r>
-      <w:r>
-        <w:t xml:space="preserve">Hz</w:t>
-      </w:r>
-      <w:r>
-        <w:t xml:space="preserve"> </w:t>
-      </w:r>
-      <w:r>
-        <w:t xml:space="preserve">AC</w:t>
-      </w:r>
-      <w:r>
-        <w:t xml:space="preserve"> </w:t>
-      </w:r>
-      <w:r>
-        <w:t xml:space="preserve">Backbone</w:t>
-      </w:r>
-      <w:r>
-        <w:t xml:space="preserve"> </w:t>
-      </w:r>
-      <w:r>
-        <w:t xml:space="preserve">vs. All-DC</w:t>
-      </w:r>
-      <w:r>
-        <w:t xml:space="preserve"> </w:t>
-      </w:r>
-      <w:r>
-        <w:t xml:space="preserve">Grid</w:t>
-      </w:r>
-      <w:r>
-        <w:t xml:space="preserve"> </w:t>
-      </w:r>
-      <w:r>
-        <w:t xml:space="preserve">Architecture</w:t>
+        <w:t xml:space="preserve">Technical Annex: 12 Hz AC Backbone vs. All-DC Grid Architecture</w:t>
       </w:r>
     </w:p>
     <w:p>
@@ -63,49 +15,7 @@
         <w:pStyle w:val="Subtitle"/>
       </w:pPr>
       <w:r>
-        <w:t xml:space="preserve">National</w:t>
-      </w:r>
-      <w:r>
-        <w:t xml:space="preserve"> </w:t>
-      </w:r>
-      <w:r>
-        <w:t xml:space="preserve">Power</w:t>
-      </w:r>
-      <w:r>
-        <w:t xml:space="preserve"> </w:t>
-      </w:r>
-      <w:r>
-        <w:t xml:space="preserve">Grid</w:t>
-      </w:r>
-      <w:r>
-        <w:t xml:space="preserve"> </w:t>
-      </w:r>
-      <w:r>
-        <w:t xml:space="preserve">Reconstruction</w:t>
-      </w:r>
-      <w:r>
-        <w:t xml:space="preserve"> </w:t>
-      </w:r>
-      <w:r>
-        <w:t xml:space="preserve">&amp;</w:t>
-      </w:r>
-      <w:r>
-        <w:t xml:space="preserve"> </w:t>
-      </w:r>
-      <w:r>
-        <w:t xml:space="preserve">Sovereign</w:t>
-      </w:r>
-      <w:r>
-        <w:t xml:space="preserve"> </w:t>
-      </w:r>
-      <w:r>
-        <w:t xml:space="preserve">Resilience</w:t>
-      </w:r>
-      <w:r>
-        <w:t xml:space="preserve"> </w:t>
-      </w:r>
-      <w:r>
-        <w:t xml:space="preserve">Program</w:t>
+        <w:t xml:space="preserve">National Power Grid Reconstruction &amp; Sovereign Resilience Program</w:t>
       </w:r>
     </w:p>
     <w:p>
@@ -113,13 +23,7 @@
         <w:pStyle w:val="Author"/>
       </w:pPr>
       <w:r>
-        <w:t xml:space="preserve">David</w:t>
-      </w:r>
-      <w:r>
-        <w:t xml:space="preserve"> </w:t>
-      </w:r>
-      <w:r>
-        <w:t xml:space="preserve">Walther</w:t>
+        <w:t xml:space="preserve">David Walther</w:t>
       </w:r>
     </w:p>
     <w:p>
@@ -136,8 +40,8 @@
       </w:pPr>
       <w:r>
         <w:rPr>
+          <w:b/>
           <w:bCs/>
-          <w:b/>
         </w:rPr>
         <w:t xml:space="preserve">TECHNICAL ANNEX</w:t>
       </w:r>
@@ -148,8 +52,8 @@
       </w:pPr>
       <w:r>
         <w:rPr>
+          <w:b/>
           <w:bCs/>
-          <w:b/>
         </w:rPr>
         <w:t xml:space="preserve">12 Hz AC Backbone vs. All-DC Grid Architecture</w:t>
       </w:r>
@@ -160,8 +64,8 @@
       </w:pPr>
       <w:r>
         <w:rPr>
+          <w:i/>
           <w:iCs/>
-          <w:i/>
         </w:rPr>
         <w:t xml:space="preserve">Comparative Analysis for Developing-Nation Deployment</w:t>
       </w:r>
@@ -188,8 +92,8 @@
       </w:pPr>
       <w:r>
         <w:rPr>
+          <w:b/>
           <w:bCs/>
-          <w:b/>
         </w:rPr>
         <w:t xml:space="preserve">National Power Grid Reconstruction &amp; Sovereign Resilience Program</w:t>
       </w:r>
@@ -280,8 +184,8 @@
       </w:pPr>
       <w:r>
         <w:rPr>
+          <w:b/>
           <w:bCs/>
-          <w:b/>
         </w:rPr>
         <w:t xml:space="preserve">Tier 1 — EHV/HV Transmission (345–765 kV, 12 Hz):</w:t>
       </w:r>
@@ -298,8 +202,8 @@
       </w:pPr>
       <w:r>
         <w:rPr>
+          <w:b/>
           <w:bCs/>
-          <w:b/>
         </w:rPr>
         <w:t xml:space="preserve">Tier 2 — Sub-transmission/Distribution (34.5–69 kV, 12 Hz):</w:t>
       </w:r>
@@ -316,8 +220,8 @@
       </w:pPr>
       <w:r>
         <w:rPr>
+          <w:b/>
           <w:bCs/>
-          <w:b/>
         </w:rPr>
         <w:t xml:space="preserve">Tier 3 — Consumer Service (600V-class three-phase wye, 12 Hz):</w:t>
       </w:r>
@@ -325,43 +229,7 @@
         <w:t xml:space="preserve"> </w:t>
       </w:r>
       <w:r>
-        <w:t xml:space="preserve">600V is the equipment rating ceiling (wire, breakers, conduit), not the nominal operating voltage. Distribution output is set at approximately 575–580V nominal, allowing for 5–10% voltage drop along the distribution line. The near consumer sees approximately 570–580V line-to-line (329–335V line-to-neutral). The far consumer after line losses sees approximately 530–550V line-to-line (306–318V line-to-neutral). This is standard utility practice — North American</w:t>
-      </w:r>
-      <w:r>
-        <w:t xml:space="preserve"> </w:t>
-      </w:r>
-      <w:r>
-        <w:t xml:space="preserve">“</w:t>
-      </w:r>
-      <w:r>
-        <w:t xml:space="preserve">120V</w:t>
-      </w:r>
-      <w:r>
-        <w:t xml:space="preserve">”</w:t>
-      </w:r>
-      <w:r>
-        <w:t xml:space="preserve"> </w:t>
-      </w:r>
-      <w:r>
-        <w:t xml:space="preserve">actually delivers 114–126V; European</w:t>
-      </w:r>
-      <w:r>
-        <w:t xml:space="preserve"> </w:t>
-      </w:r>
-      <w:r>
-        <w:t xml:space="preserve">“</w:t>
-      </w:r>
-      <w:r>
-        <w:t xml:space="preserve">230V</w:t>
-      </w:r>
-      <w:r>
-        <w:t xml:space="preserve">”</w:t>
-      </w:r>
-      <w:r>
-        <w:t xml:space="preserve"> </w:t>
-      </w:r>
-      <w:r>
-        <w:t xml:space="preserve">delivers 207–253V. Standard building wire (THHN/THWN, NM-B) rated for 600V accommodates the entire range with margin. 600V breakers are commodity industrial items. Heavy loads (EV charging, heat pumps, induction cooktops) wire line-to-line at 530–580V. Branch circuits wire line-to-neutral at 306–335V. Modern loads — LED lighting, computers, inverter-driven appliances — rectify internally and are both frequency-agnostic and voltage-tolerant across this range. Resistive loads (heating, water heating) work at any frequency and any voltage within the range. Three-phase lighting fixtures eliminate flicker through balanced power summation.</w:t>
+        <w:t xml:space="preserve">600V is the equipment rating ceiling (wire, breakers, conduit), not the nominal operating voltage. Distribution output is set at approximately 575–580V nominal, allowing for 5–10% voltage drop along the distribution line. The near consumer sees approximately 570–580V line-to-line (329–335V line-to-neutral). The far consumer after line losses sees approximately 530–550V line-to-line (306–318V line-to-neutral). This is standard utility practice — North American “120V” actually delivers 114–126V; European “230V” delivers 207–253V. Standard building wire (THHN/THWN, NM-B) rated for 600V accommodates the entire range with margin. 600V breakers are commodity industrial items. Heavy loads (EV charging, heat pumps, induction cooktops) wire line-to-line at 530–580V. Branch circuits wire line-to-neutral at 306–335V. Modern loads — LED lighting, computers, inverter-driven appliances — rectify internally and are both frequency-agnostic and voltage-tolerant across this range. Resistive loads (heating, water heating) work at any frequency and any voltage within the range. Three-phase lighting fixtures eliminate flicker through balanced power summation.</w:t>
       </w:r>
     </w:p>
     <w:p>
@@ -394,8 +262,8 @@
       </w:pPr>
       <w:r>
         <w:rPr>
+          <w:b/>
           <w:bCs/>
-          <w:b/>
         </w:rPr>
         <w:t xml:space="preserve">Tier 1 — DC Transmission (115–765 kV DC):</w:t>
       </w:r>
@@ -412,8 +280,8 @@
       </w:pPr>
       <w:r>
         <w:rPr>
+          <w:b/>
           <w:bCs/>
-          <w:b/>
         </w:rPr>
         <w:t xml:space="preserve">Tier 2 — DC Distribution (4–35 kV DC stepping to 380V DC):</w:t>
       </w:r>
@@ -421,25 +289,7 @@
         <w:t xml:space="preserve"> </w:t>
       </w:r>
       <w:r>
-        <w:t xml:space="preserve">Regional and local distribution. Voltage step-down from transmission to neighborhood and then to building bus via multiple SST stages. The 380V building bus level is chosen for compatibility with existing 400V-class component supply chains, battery voltage matching (350–450V range for most high-voltage battery packs), and favorable safety/insulation standards below the</w:t>
-      </w:r>
-      <w:r>
-        <w:t xml:space="preserve"> </w:t>
-      </w:r>
-      <w:r>
-        <w:t xml:space="preserve">“</w:t>
-      </w:r>
-      <w:r>
-        <w:t xml:space="preserve">safety cliff</w:t>
-      </w:r>
-      <w:r>
-        <w:t xml:space="preserve">”</w:t>
-      </w:r>
-      <w:r>
-        <w:t xml:space="preserve"> </w:t>
-      </w:r>
-      <w:r>
-        <w:t xml:space="preserve">where arcing becomes difficult to manage with affordable breakers.</w:t>
+        <w:t xml:space="preserve">Regional and local distribution. Voltage step-down from transmission to neighborhood and then to building bus via multiple SST stages. The 380V building bus level is chosen for compatibility with existing 400V-class component supply chains, battery voltage matching (350–450V range for most high-voltage battery packs), and favorable safety/insulation standards below the “safety cliff” where arcing becomes difficult to manage with affordable breakers.</w:t>
       </w:r>
     </w:p>
     <w:p>
@@ -448,8 +298,8 @@
       </w:pPr>
       <w:r>
         <w:rPr>
+          <w:b/>
           <w:bCs/>
-          <w:b/>
         </w:rPr>
         <w:t xml:space="preserve">Tier 3 — Consumer endpoints (380V DC):</w:t>
       </w:r>
@@ -640,8 +490,8 @@
       <w:tblPr>
         <w:tblStyle w:val="Table"/>
         <w:tblW w:type="pct" w:w="5000"/>
+        <w:tblLayout w:type="fixed"/>
         <w:tblLook w:firstRow="0" w:lastRow="0" w:firstColumn="0" w:lastColumn="0" w:noHBand="0" w:noVBand="0" w:val="0000"/>
-        <w:jc w:val="start"/>
       </w:tblPr>
       <w:tblGrid>
         <w:gridCol w:w="2430"/>
@@ -659,8 +509,8 @@
             </w:pPr>
             <w:r>
               <w:rPr>
+                <w:b/>
                 <w:bCs/>
-                <w:b/>
               </w:rPr>
               <w:t xml:space="preserve">Stage</w:t>
             </w:r>
@@ -675,8 +525,8 @@
             </w:pPr>
             <w:r>
               <w:rPr>
+                <w:b/>
                 <w:bCs/>
-                <w:b/>
               </w:rPr>
               <w:t xml:space="preserve">12 Hz AC Grid</w:t>
             </w:r>
@@ -691,8 +541,8 @@
             </w:pPr>
             <w:r>
               <w:rPr>
+                <w:b/>
                 <w:bCs/>
-                <w:b/>
               </w:rPr>
               <w:t xml:space="preserve">All-DC Grid</w:t>
             </w:r>
@@ -707,8 +557,8 @@
             </w:pPr>
             <w:r>
               <w:rPr>
+                <w:b/>
                 <w:bCs/>
-                <w:b/>
               </w:rPr>
               <w:t xml:space="preserve">Conv. 50 Hz AC</w:t>
             </w:r>
@@ -1102,8 +952,8 @@
       <w:tblPr>
         <w:tblStyle w:val="Table"/>
         <w:tblW w:type="pct" w:w="5000"/>
+        <w:tblLayout w:type="fixed"/>
         <w:tblLook w:firstRow="0" w:lastRow="0" w:firstColumn="0" w:lastColumn="0" w:noHBand="0" w:noVBand="0" w:val="0000"/>
-        <w:jc w:val="start"/>
       </w:tblPr>
       <w:tblGrid>
         <w:gridCol w:w="1669"/>
@@ -1120,8 +970,8 @@
             </w:pPr>
             <w:r>
               <w:rPr>
+                <w:b/>
                 <w:bCs/>
-                <w:b/>
               </w:rPr>
               <w:t xml:space="preserve">Grid Function</w:t>
             </w:r>
@@ -1136,8 +986,8 @@
             </w:pPr>
             <w:r>
               <w:rPr>
+                <w:b/>
                 <w:bCs/>
-                <w:b/>
               </w:rPr>
               <w:t xml:space="preserve">12 Hz AC Architecture</w:t>
             </w:r>
@@ -1152,8 +1002,8 @@
             </w:pPr>
             <w:r>
               <w:rPr>
+                <w:b/>
                 <w:bCs/>
-                <w:b/>
               </w:rPr>
               <w:t xml:space="preserve">All-DC Architecture</w:t>
             </w:r>
@@ -1498,25 +1348,7 @@
         <w:pStyle w:val="BodyText"/>
       </w:pPr>
       <w:r>
-        <w:t xml:space="preserve">DC circuit breaking specifications confirm this challenge:</w:t>
-      </w:r>
-      <w:r>
-        <w:t xml:space="preserve"> </w:t>
-      </w:r>
-      <w:r>
-        <w:t xml:space="preserve">“</w:t>
-      </w:r>
-      <w:r>
-        <w:t xml:space="preserve">Because DC doesn’t have a zero-crossing point, it is much harder to stop. This requires Hybrid or Solid-State DC Breakers, which use significantly more power electronics and specialized cooling materials than standard AC breakers.</w:t>
-      </w:r>
-      <w:r>
-        <w:t xml:space="preserve">”</w:t>
-      </w:r>
-      <w:r>
-        <w:t xml:space="preserve"> </w:t>
-      </w:r>
-      <w:r>
-        <w:t xml:space="preserve">Smart solid-state circuit breakers for 380V DC systems have a cited payback period of 2.16 years — meaning the SSCBs are expensive enough ($2,000–$10,000 each for distribution-class, vs. $200–$1,000 for an equivalent AC breaker) to require over two years of efficiency savings to justify their purchase. In the all-DC grid, the most safety-critical function — fault interruption — depends on the component with the shortest lifespan and the most constrained supply chain.</w:t>
+        <w:t xml:space="preserve">DC circuit breaking specifications confirm this challenge: “Because DC doesn’t have a zero-crossing point, it is much harder to stop. This requires Hybrid or Solid-State DC Breakers, which use significantly more power electronics and specialized cooling materials than standard AC breakers.” Smart solid-state circuit breakers for 380V DC systems have a cited payback period of 2.16 years — meaning the SSCBs are expensive enough ($2,000–$10,000 each for distribution-class, vs. $200–$1,000 for an equivalent AC breaker) to require over two years of efficiency savings to justify their purchase. In the all-DC grid, the most safety-critical function — fault interruption — depends on the component with the shortest lifespan and the most constrained supply chain.</w:t>
       </w:r>
     </w:p>
     <w:p>
@@ -1572,25 +1404,7 @@
         <w:pStyle w:val="BodyText"/>
       </w:pPr>
       <w:r>
-        <w:t xml:space="preserve">The claim of</w:t>
-      </w:r>
-      <w:r>
-        <w:t xml:space="preserve"> </w:t>
-      </w:r>
-      <w:r>
-        <w:t xml:space="preserve">“</w:t>
-      </w:r>
-      <w:r>
-        <w:t xml:space="preserve">30–40 year</w:t>
-      </w:r>
-      <w:r>
-        <w:t xml:space="preserve">”</w:t>
-      </w:r>
-      <w:r>
-        <w:t xml:space="preserve"> </w:t>
-      </w:r>
-      <w:r>
-        <w:t xml:space="preserve">semiconductor lifespan refers to the converter station as a system, not individual modules. Stations achieve multi-decade service life through ongoing module replacement — the Ship of Theseus. Each replacement requires procurement from the semiconductor supply chain. Supporting components have shorter lifespans: electrolytic capacitors 5–15 years, cooling fans 3–7 years, control boards degrading from thermal cycling and humidity.</w:t>
+        <w:t xml:space="preserve">The claim of “30–40 year” semiconductor lifespan refers to the converter station as a system, not individual modules. Stations achieve multi-decade service life through ongoing module replacement — the Ship of Theseus. Each replacement requires procurement from the semiconductor supply chain. Supporting components have shorter lifespans: electrolytic capacitors 5–15 years, cooling fans 3–7 years, control boards degrading from thermal cycling and humidity.</w:t>
       </w:r>
     </w:p>
     <w:p>
@@ -1621,8 +1435,8 @@
       <w:tblPr>
         <w:tblStyle w:val="Table"/>
         <w:tblW w:type="pct" w:w="5000"/>
+        <w:tblLayout w:type="fixed"/>
         <w:tblLook w:firstRow="0" w:lastRow="0" w:firstColumn="0" w:lastColumn="0" w:noHBand="0" w:noVBand="0" w:val="0000"/>
-        <w:jc w:val="start"/>
       </w:tblPr>
       <w:tblGrid>
         <w:gridCol w:w="1037"/>
@@ -1639,8 +1453,8 @@
             </w:pPr>
             <w:r>
               <w:rPr>
+                <w:b/>
                 <w:bCs/>
-                <w:b/>
               </w:rPr>
               <w:t xml:space="preserve">Metric</w:t>
             </w:r>
@@ -1655,8 +1469,8 @@
             </w:pPr>
             <w:r>
               <w:rPr>
+                <w:b/>
                 <w:bCs/>
-                <w:b/>
               </w:rPr>
               <w:t xml:space="preserve">12 Hz AC Transformer</w:t>
             </w:r>
@@ -1671,8 +1485,8 @@
             </w:pPr>
             <w:r>
               <w:rPr>
+                <w:b/>
                 <w:bCs/>
-                <w:b/>
               </w:rPr>
               <w:t xml:space="preserve">DC SST / Converter</w:t>
             </w:r>
@@ -1884,8 +1698,8 @@
       </w:pPr>
       <w:r>
         <w:rPr>
+          <w:b/>
           <w:bCs/>
-          <w:b/>
         </w:rPr>
         <w:t xml:space="preserve">12 Hz AC Transformer Substation:</w:t>
       </w:r>
@@ -1902,8 +1716,8 @@
       </w:pPr>
       <w:r>
         <w:rPr>
+          <w:b/>
           <w:bCs/>
-          <w:b/>
         </w:rPr>
         <w:t xml:space="preserve">DC SST/Converter Station:</w:t>
       </w:r>
@@ -1936,8 +1750,8 @@
       </w:pPr>
       <w:r>
         <w:rPr>
+          <w:b/>
           <w:bCs/>
-          <w:b/>
         </w:rPr>
         <w:t xml:space="preserve">12 Hz AC:</w:t>
       </w:r>
@@ -1954,8 +1768,8 @@
       </w:pPr>
       <w:r>
         <w:rPr>
+          <w:b/>
           <w:bCs/>
-          <w:b/>
         </w:rPr>
         <w:t xml:space="preserve">All-DC:</w:t>
       </w:r>
@@ -1988,8 +1802,8 @@
       </w:pPr>
       <w:r>
         <w:rPr>
+          <w:b/>
           <w:bCs/>
-          <w:b/>
         </w:rPr>
         <w:t xml:space="preserve">Transformer installation:</w:t>
       </w:r>
@@ -2006,8 +1820,8 @@
       </w:pPr>
       <w:r>
         <w:rPr>
+          <w:b/>
           <w:bCs/>
-          <w:b/>
         </w:rPr>
         <w:t xml:space="preserve">SST/Converter commissioning:</w:t>
       </w:r>
@@ -2032,8 +1846,8 @@
       </w:pPr>
       <w:r>
         <w:rPr>
+          <w:b/>
           <w:bCs/>
-          <w:b/>
         </w:rPr>
         <w:t xml:space="preserve">Transformer maintenance:</w:t>
       </w:r>
@@ -2050,8 +1864,8 @@
       </w:pPr>
       <w:r>
         <w:rPr>
+          <w:b/>
           <w:bCs/>
-          <w:b/>
         </w:rPr>
         <w:t xml:space="preserve">SST/Converter maintenance:</w:t>
       </w:r>
@@ -2163,25 +1977,7 @@
         <w:pStyle w:val="BodyText"/>
       </w:pPr>
       <w:r>
-        <w:t xml:space="preserve">The implication is decisive: there is no need to modify the 12 Hz AC system to deliver 380V line-to-neutral. Doing so would require 380V × √3 = 658V line-to-line, pushing past the 600V wire rating into 1000V-class wiring, industrial-grade switchgear, and higher insulation classes — the same</w:t>
-      </w:r>
-      <w:r>
-        <w:t xml:space="preserve"> </w:t>
-      </w:r>
-      <w:r>
-        <w:t xml:space="preserve">“</w:t>
-      </w:r>
-      <w:r>
-        <w:t xml:space="preserve">safety cliff</w:t>
-      </w:r>
-      <w:r>
-        <w:t xml:space="preserve">”</w:t>
-      </w:r>
-      <w:r>
-        <w:t xml:space="preserve"> </w:t>
-      </w:r>
-      <w:r>
-        <w:t xml:space="preserve">identified in DC distribution literature as the reason not to exceed 600V. The 600V-class system stays below this cliff while feeding equipment designed for 380V DC through a commodity bridge rectifier. The three-phase wye geometry delivers the target voltage through trigonometry rather than through a conversion device.</w:t>
+        <w:t xml:space="preserve">The implication is decisive: there is no need to modify the 12 Hz AC system to deliver 380V line-to-neutral. Doing so would require 380V × √3 = 658V line-to-line, pushing past the 600V wire rating into 1000V-class wiring, industrial-grade switchgear, and higher insulation classes — the same “safety cliff” identified in DC distribution literature as the reason not to exceed 600V. The 600V-class system stays below this cliff while feeding equipment designed for 380V DC through a commodity bridge rectifier. The three-phase wye geometry delivers the target voltage through trigonometry rather than through a conversion device.</w:t>
       </w:r>
     </w:p>
     <w:p>
@@ -2214,8 +2010,8 @@
       </w:pPr>
       <w:r>
         <w:rPr>
+          <w:b/>
           <w:bCs/>
-          <w:b/>
         </w:rPr>
         <w:t xml:space="preserve">380V DC building bus option:</w:t>
       </w:r>
@@ -2232,8 +2028,8 @@
       </w:pPr>
       <w:r>
         <w:rPr>
+          <w:b/>
           <w:bCs/>
-          <w:b/>
         </w:rPr>
         <w:t xml:space="preserve">Direct battery integration:</w:t>
       </w:r>
@@ -2250,8 +2046,8 @@
       </w:pPr>
       <w:r>
         <w:rPr>
+          <w:b/>
           <w:bCs/>
-          <w:b/>
         </w:rPr>
         <w:t xml:space="preserve">DC-native appliance compatibility:</w:t>
       </w:r>
@@ -2274,8 +2070,8 @@
       <w:tblPr>
         <w:tblStyle w:val="Table"/>
         <w:tblW w:type="pct" w:w="5000"/>
+        <w:tblLayout w:type="fixed"/>
         <w:tblLook w:firstRow="0" w:lastRow="0" w:firstColumn="0" w:lastColumn="0" w:noHBand="0" w:noVBand="0" w:val="0000"/>
-        <w:jc w:val="start"/>
       </w:tblPr>
       <w:tblGrid>
         <w:gridCol w:w="1382"/>
@@ -2293,8 +2089,8 @@
             </w:pPr>
             <w:r>
               <w:rPr>
+                <w:b/>
                 <w:bCs/>
-                <w:b/>
               </w:rPr>
               <w:t xml:space="preserve">Component</w:t>
             </w:r>
@@ -2309,8 +2105,8 @@
             </w:pPr>
             <w:r>
               <w:rPr>
+                <w:b/>
                 <w:bCs/>
-                <w:b/>
               </w:rPr>
               <w:t xml:space="preserve">12 Hz AC (306–335V / 600V-class)</w:t>
             </w:r>
@@ -2325,8 +2121,8 @@
             </w:pPr>
             <w:r>
               <w:rPr>
+                <w:b/>
                 <w:bCs/>
-                <w:b/>
               </w:rPr>
               <w:t xml:space="preserve">All-DC (380V building)</w:t>
             </w:r>
@@ -2341,8 +2137,8 @@
             </w:pPr>
             <w:r>
               <w:rPr>
+                <w:b/>
                 <w:bCs/>
-                <w:b/>
               </w:rPr>
               <w:t xml:space="preserve">Advantage</w:t>
             </w:r>
@@ -2951,25 +2747,7 @@
         <w:pStyle w:val="BodyText"/>
       </w:pPr>
       <w:r>
-        <w:t xml:space="preserve">The 12 Hz architecture transfers capability, not product. Train local technicians to wind transformers from local materials. Build local workshops. The</w:t>
-      </w:r>
-      <w:r>
-        <w:t xml:space="preserve"> </w:t>
-      </w:r>
-      <w:r>
-        <w:t xml:space="preserve">“</w:t>
-      </w:r>
-      <w:r>
-        <w:t xml:space="preserve">benefit</w:t>
-      </w:r>
-      <w:r>
-        <w:t xml:space="preserve">”</w:t>
-      </w:r>
-      <w:r>
-        <w:t xml:space="preserve"> </w:t>
-      </w:r>
-      <w:r>
-        <w:t xml:space="preserve">of faster electrification through imported semiconductor-dependent infrastructure is real but temporary if it creates permanent dependency. Fast electrification that creates structural dependency is not development — it is a subscription service disguised as infrastructure.</w:t>
+        <w:t xml:space="preserve">The 12 Hz architecture transfers capability, not product. Train local technicians to wind transformers from local materials. Build local workshops. The “benefit” of faster electrification through imported semiconductor-dependent infrastructure is real but temporary if it creates permanent dependency. Fast electrification that creates structural dependency is not development — it is a subscription service disguised as infrastructure.</w:t>
       </w:r>
     </w:p>
     <w:p>
@@ -3058,8 +2836,8 @@
       </w:pPr>
       <w:r>
         <w:rPr>
+          <w:b/>
           <w:bCs/>
-          <w:b/>
         </w:rPr>
         <w:t xml:space="preserve">Under the 12 Hz AC architecture:</w:t>
       </w:r>
@@ -3076,8 +2854,8 @@
       </w:pPr>
       <w:r>
         <w:rPr>
+          <w:b/>
           <w:bCs/>
-          <w:b/>
         </w:rPr>
         <w:t xml:space="preserve">Under the all-DC architecture:</w:t>
       </w:r>
@@ -3109,25 +2887,7 @@
         <w:pStyle w:val="BodyText"/>
       </w:pPr>
       <w:r>
-        <w:t xml:space="preserve">Uganda illustrates the deployment environment that any grid architecture must survive. According to field reports from energy sector participants based in Uganda: approximately half the population has a grid connection, but only about 15% actually use electricity. Reliability is extremely poor — frequent blackouts and voltage surges that age electronic equipment including inverters. Approximately 70% of the country burns charcoal for cooking and boiling water, and kerosene for lighting. Electricity tariffs have triggered violent riots (as in South Africa and Pakistan). Illegal informal connections to the grid are widespread, with the government at one point threatening capital punishment for</w:t>
-      </w:r>
-      <w:r>
-        <w:t xml:space="preserve"> </w:t>
-      </w:r>
-      <w:r>
-        <w:t xml:space="preserve">“</w:t>
-      </w:r>
-      <w:r>
-        <w:t xml:space="preserve">power thieves.</w:t>
-      </w:r>
-      <w:r>
-        <w:t xml:space="preserve">”</w:t>
-      </w:r>
-      <w:r>
-        <w:t xml:space="preserve"> </w:t>
-      </w:r>
-      <w:r>
-        <w:t xml:space="preserve">The former distribution company UMEME (owned by South Africa’s Eskom) was broadly criticized for incompetence and corruption during its 20-year concession, which ended in late 2024.</w:t>
+        <w:t xml:space="preserve">Uganda illustrates the deployment environment that any grid architecture must survive. According to field reports from energy sector participants based in Uganda: approximately half the population has a grid connection, but only about 15% actually use electricity. Reliability is extremely poor — frequent blackouts and voltage surges that age electronic equipment including inverters. Approximately 70% of the country burns charcoal for cooking and boiling water, and kerosene for lighting. Electricity tariffs have triggered violent riots (as in South Africa and Pakistan). Illegal informal connections to the grid are widespread, with the government at one point threatening capital punishment for “power thieves.” The former distribution company UMEME (owned by South Africa’s Eskom) was broadly criticized for incompetence and corruption during its 20-year concession, which ended in late 2024.</w:t>
       </w:r>
     </w:p>
     <w:p>
@@ -3160,8 +2920,8 @@
       </w:pPr>
       <w:r>
         <w:rPr>
+          <w:b/>
           <w:bCs/>
-          <w:b/>
         </w:rPr>
         <w:t xml:space="preserve">Under the 12 Hz AC architecture:</w:t>
       </w:r>
@@ -3178,8 +2938,8 @@
       </w:pPr>
       <w:r>
         <w:rPr>
+          <w:b/>
           <w:bCs/>
-          <w:b/>
         </w:rPr>
         <w:t xml:space="preserve">Under the all-DC architecture:</w:t>
       </w:r>
@@ -3211,19 +2971,7 @@
         <w:pStyle w:val="BodyText"/>
       </w:pPr>
       <w:r>
-        <w:t xml:space="preserve">Pakistan provides a real-world precedent for what happens when centralized grid infrastructure fails and people build their own alternative. After electricity tariffs increased 155% in three years and LNG shortages caused widespread blackouts, millions of Pakistani households and businesses installed rooftop solar. By 2026, distributed solar reached an estimated 20% of Pakistan’s electricity supply. The country imported over 48 GW of solar panels by mid-2025 and is projected to save $6.3 billion in fossil fuel imports in 2026 alone. Pakistan’s power minister described it as a</w:t>
-      </w:r>
-      <w:r>
-        <w:t xml:space="preserve"> </w:t>
-      </w:r>
-      <w:r>
-        <w:t xml:space="preserve">“</w:t>
-      </w:r>
-      <w:r>
-        <w:t xml:space="preserve">people-led solar revolution.</w:t>
-      </w:r>
-      <w:r>
-        <w:t xml:space="preserve">”</w:t>
+        <w:t xml:space="preserve">Pakistan provides a real-world precedent for what happens when centralized grid infrastructure fails and people build their own alternative. After electricity tariffs increased 155% in three years and LNG shortages caused widespread blackouts, millions of Pakistani households and businesses installed rooftop solar. By 2026, distributed solar reached an estimated 20% of Pakistan’s electricity supply. The country imported over 48 GW of solar panels by mid-2025 and is projected to save $6.3 billion in fossil fuel imports in 2026 alone. Pakistan’s power minister described it as a “people-led solar revolution.”</w:t>
       </w:r>
     </w:p>
     <w:p>
@@ -3272,8 +3020,8 @@
       </w:pPr>
       <w:r>
         <w:rPr>
+          <w:b/>
           <w:bCs/>
-          <w:b/>
         </w:rPr>
         <w:t xml:space="preserve">Layer 1 — Generation (DC):</w:t>
       </w:r>
@@ -3290,8 +3038,8 @@
       </w:pPr>
       <w:r>
         <w:rPr>
+          <w:b/>
           <w:bCs/>
-          <w:b/>
         </w:rPr>
         <w:t xml:space="preserve">Layer 2 — Backbone (12 Hz AC):</w:t>
       </w:r>
@@ -3308,8 +3056,8 @@
       </w:pPr>
       <w:r>
         <w:rPr>
+          <w:b/>
           <w:bCs/>
-          <w:b/>
         </w:rPr>
         <w:t xml:space="preserve">Layer 3 — Building Distribution (280–325V DC from rectified AC, or direct 306–335V AC):</w:t>
       </w:r>
@@ -3326,8 +3074,8 @@
       </w:pPr>
       <w:r>
         <w:rPr>
+          <w:b/>
           <w:bCs/>
-          <w:b/>
         </w:rPr>
         <w:t xml:space="preserve">Layer 4 — End Use (DC):</w:t>
       </w:r>
@@ -3432,8 +3180,8 @@
       </w:pPr>
       <w:r>
         <w:rPr>
+          <w:b/>
           <w:bCs/>
-          <w:b/>
         </w:rPr>
         <w:t xml:space="preserve">New-build deployment (preferred):</w:t>
       </w:r>
@@ -3450,8 +3198,8 @@
       </w:pPr>
       <w:r>
         <w:rPr>
+          <w:b/>
           <w:bCs/>
-          <w:b/>
         </w:rPr>
         <w:t xml:space="preserve">Island operation alongside existing 50 Hz:</w:t>
       </w:r>
@@ -3468,8 +3216,8 @@
       </w:pPr>
       <w:r>
         <w:rPr>
+          <w:b/>
           <w:bCs/>
-          <w:b/>
         </w:rPr>
         <w:t xml:space="preserve">Full replacement of existing 50 Hz grid:</w:t>
       </w:r>
@@ -3502,8 +3250,8 @@
       </w:pPr>
       <w:r>
         <w:rPr>
+          <w:b/>
           <w:bCs/>
-          <w:b/>
         </w:rPr>
         <w:t xml:space="preserve">New-build deployment:</w:t>
       </w:r>
@@ -3520,8 +3268,8 @@
       </w:pPr>
       <w:r>
         <w:rPr>
+          <w:b/>
           <w:bCs/>
-          <w:b/>
         </w:rPr>
         <w:t xml:space="preserve">Integration with existing 50 Hz:</w:t>
       </w:r>
@@ -3538,8 +3286,8 @@
       </w:pPr>
       <w:r>
         <w:rPr>
+          <w:b/>
           <w:bCs/>
-          <w:b/>
         </w:rPr>
         <w:t xml:space="preserve">Full replacement of existing 50 Hz grid:</w:t>
       </w:r>
@@ -3562,8 +3310,8 @@
       <w:tblPr>
         <w:tblStyle w:val="Table"/>
         <w:tblW w:type="pct" w:w="5000"/>
+        <w:tblLayout w:type="fixed"/>
         <w:tblLook w:firstRow="0" w:lastRow="0" w:firstColumn="0" w:lastColumn="0" w:noHBand="0" w:noVBand="0" w:val="0000"/>
-        <w:jc w:val="start"/>
       </w:tblPr>
       <w:tblGrid>
         <w:gridCol w:w="1020"/>
@@ -3580,8 +3328,8 @@
             </w:pPr>
             <w:r>
               <w:rPr>
+                <w:b/>
                 <w:bCs/>
-                <w:b/>
               </w:rPr>
               <w:t xml:space="preserve">Scenario</w:t>
             </w:r>
@@ -3596,8 +3344,8 @@
             </w:pPr>
             <w:r>
               <w:rPr>
+                <w:b/>
                 <w:bCs/>
-                <w:b/>
               </w:rPr>
               <w:t xml:space="preserve">12 Hz AC</w:t>
             </w:r>
@@ -3612,8 +3360,8 @@
             </w:pPr>
             <w:r>
               <w:rPr>
+                <w:b/>
                 <w:bCs/>
-                <w:b/>
               </w:rPr>
               <w:t xml:space="preserve">All-DC</w:t>
             </w:r>
@@ -3817,8 +3565,8 @@
       <w:tblPr>
         <w:tblStyle w:val="Table"/>
         <w:tblW w:type="pct" w:w="5000"/>
+        <w:tblLayout w:type="fixed"/>
         <w:tblLook w:firstRow="1" w:lastRow="0" w:firstColumn="0" w:lastColumn="0" w:noHBand="0" w:noVBand="0" w:val="0020"/>
-        <w:jc w:val="start"/>
       </w:tblPr>
       <w:tblGrid>
         <w:gridCol w:w="286"/>
@@ -3827,19 +3575,18 @@
       </w:tblGrid>
       <w:tr>
         <w:trPr>
-          <w:tblHeader w:val="true"/>
+          <w:tblHeader w:val="on"/>
         </w:trPr>
         <w:tc>
           <w:tcPr/>
           <w:p>
             <w:pPr>
               <w:pStyle w:val="Compact"/>
-              <w:jc w:val="left"/>
             </w:pPr>
             <w:r>
               <w:rPr>
+                <w:b/>
                 <w:bCs/>
-                <w:b/>
               </w:rPr>
               <w:t xml:space="preserve">Category</w:t>
             </w:r>
@@ -3850,12 +3597,11 @@
           <w:p>
             <w:pPr>
               <w:pStyle w:val="Compact"/>
-              <w:jc w:val="left"/>
             </w:pPr>
             <w:r>
               <w:rPr>
+                <w:b/>
                 <w:bCs/>
-                <w:b/>
               </w:rPr>
               <w:t xml:space="preserve">12 Hz AC</w:t>
             </w:r>
@@ -3866,12 +3612,11 @@
           <w:p>
             <w:pPr>
               <w:pStyle w:val="Compact"/>
-              <w:jc w:val="left"/>
             </w:pPr>
             <w:r>
               <w:rPr>
+                <w:b/>
                 <w:bCs/>
-                <w:b/>
               </w:rPr>
               <w:t xml:space="preserve">All-DC</w:t>
             </w:r>
@@ -3884,7 +3629,6 @@
           <w:p>
             <w:pPr>
               <w:pStyle w:val="Compact"/>
-              <w:jc w:val="left"/>
             </w:pPr>
             <w:r>
               <w:t xml:space="preserve">Technology Maturity</w:t>
@@ -3896,7 +3640,6 @@
           <w:p>
             <w:pPr>
               <w:pStyle w:val="Compact"/>
-              <w:jc w:val="left"/>
             </w:pPr>
             <w:r>
               <w:t xml:space="preserve">Manageable: No 12 Hz grid exists, but the closely related 16.7 Hz European rail network has operated since 1913. Over 110 years of operational history at a frequency within 39% of the target. The step from 16.7 Hz to 12 Hz is a core sizing change, not a new technology. A pilot installation would confirm system-level integration, but no fundamental unknowns exist.</w:t>
@@ -3908,7 +3651,6 @@
           <w:p>
             <w:pPr>
               <w:pStyle w:val="Compact"/>
-              <w:jc w:val="left"/>
             </w:pPr>
             <w:r>
               <w:t xml:space="preserve">Partially proven: HVDC point-to-point links are mature. Multi-terminal DC grids and meshed DC networks remain largely experimental. No multi-terminal DC grid at national scale has been built.</w:t>
@@ -3922,7 +3664,6 @@
           <w:p>
             <w:pPr>
               <w:pStyle w:val="Compact"/>
-              <w:jc w:val="left"/>
             </w:pPr>
             <w:r>
               <w:t xml:space="preserve">Equipment Availability</w:t>
@@ -3934,7 +3675,6 @@
           <w:p>
             <w:pPr>
               <w:pStyle w:val="Compact"/>
-              <w:jc w:val="left"/>
             </w:pPr>
             <w:r>
               <w:t xml:space="preserve">Manageable: 16.7 Hz transformers, generators, and switchgear are manufactured by Siemens, ABB, and others for the European rail network. Custom specification is required for 12 Hz but within established practice — no new materials, processes, or physics. First-article lead time: 6–12 months.</w:t>
@@ -3946,7 +3686,6 @@
           <w:p>
             <w:pPr>
               <w:pStyle w:val="Compact"/>
-              <w:jc w:val="left"/>
             </w:pPr>
             <w:r>
               <w:t xml:space="preserve">Limited: SSTs at grid scale (100+ MW) are not commercially available. SSCBs at transmission voltage (115–765 kV) are prototype-stage. 380V DC building components exist but are niche.</w:t>
@@ -3960,7 +3699,6 @@
           <w:p>
             <w:pPr>
               <w:pStyle w:val="Compact"/>
-              <w:jc w:val="left"/>
             </w:pPr>
             <w:r>
               <w:t xml:space="preserve">DC Fault Protection</w:t>
@@ -3972,7 +3710,6 @@
           <w:p>
             <w:pPr>
               <w:pStyle w:val="Compact"/>
-              <w:jc w:val="left"/>
             </w:pPr>
             <w:r>
               <w:t xml:space="preserve">Not applicable: AC zero-crossing provides natural arc extinction every 41.7 ms at 12 Hz. Proven electromechanical breaker technology.</w:t>
@@ -3984,7 +3721,6 @@
           <w:p>
             <w:pPr>
               <w:pStyle w:val="Compact"/>
-              <w:jc w:val="left"/>
             </w:pPr>
             <w:r>
               <w:t xml:space="preserve">Significant cost and complexity disadvantage, not a showstopper. DC breakers exist and function. However, they require semiconductor switches (IGBTs) or artificial oscillatory circuits to force arc extinction because DC has no zero crossing. At transmission voltage (115–765 kV), hybrid breakers cost 5–10x more than AC equivalents and place semiconductors in the fault protection path — adding supply chain dependency to the most safety-critical function. DC breakers are proven in HVDC point-to-point applications but remain expensive and semiconductor-dependent.</w:t>
@@ -3998,7 +3734,6 @@
           <w:p>
             <w:pPr>
               <w:pStyle w:val="Compact"/>
-              <w:jc w:val="left"/>
             </w:pPr>
             <w:r>
               <w:t xml:space="preserve">Thermomechanical Fatigue (PHYSICS)</w:t>
@@ -4010,7 +3745,6 @@
           <w:p>
             <w:pPr>
               <w:pStyle w:val="Compact"/>
-              <w:jc w:val="left"/>
             </w:pPr>
             <w:r>
               <w:t xml:space="preserve">Not applicable: Transformers have no semiconductor packaging. Primary aging mechanism (cellulose insulation degradation) is slow and monitorable over 40–60 year lifespans.</w:t>
@@ -4022,7 +3756,6 @@
           <w:p>
             <w:pPr>
               <w:pStyle w:val="Compact"/>
-              <w:jc w:val="left"/>
             </w:pPr>
             <w:r>
               <w:t xml:space="preserve">PHYSICS CONSTRAINT: Power semiconductor failure is dominated by thermomechanical fatigue — solder joint cracking, bond wire lift-off, substrate delamination — caused by differential thermal expansion. Silicon, copper, solder, and ceramic have different coefficients of thermal expansion. Every thermal cycle accumulates irreversible fatigue damage. In equatorial deployment with daily thermal cycling between 45°C daytime load and 20°C nighttime idle, fatigue life is a fraction of laboratory specifications. This can be managed (better packaging, overrating, controlled environments) but not eliminated. It imposes a permanent maintenance cycle of semiconductor module replacement every 10–20 years at every backbone node.</w:t>
@@ -4036,7 +3769,6 @@
           <w:p>
             <w:pPr>
               <w:pStyle w:val="Compact"/>
-              <w:jc w:val="left"/>
             </w:pPr>
             <w:r>
               <w:t xml:space="preserve">Thermal Management (PHYSICS)</w:t>
@@ -4048,7 +3780,6 @@
           <w:p>
             <w:pPr>
               <w:pStyle w:val="Compact"/>
-              <w:jc w:val="left"/>
             </w:pPr>
             <w:r>
               <w:t xml:space="preserve">Not a concern: Oil-cooled transformers reject waste heat passively. No active cooling components.</w:t>
@@ -4060,7 +3791,6 @@
           <w:p>
             <w:pPr>
               <w:pStyle w:val="Compact"/>
-              <w:jc w:val="left"/>
             </w:pPr>
             <w:r>
               <w:t xml:space="preserve">PHYSICS CONSTRAINT: SSTs dissipate 2–5% of throughput as waste heat. In equatorial climates (35–45°C ambient), semiconductor junctions at 65–80°C have 20–35°C of headroom. Active cooling is mandatory, consuming parasitic power and introducing mechanical failure modes (fans $50–$200 each, 3–7 year lifespan). Dust accumulation reduces cooling effectiveness. The Second Law requires energy expenditure for every watt removed. These constraints are permanent — they define the operating envelope.</w:t>
@@ -4074,7 +3804,6 @@
           <w:p>
             <w:pPr>
               <w:pStyle w:val="Compact"/>
-              <w:jc w:val="left"/>
             </w:pPr>
             <w:r>
               <w:t xml:space="preserve">Semiconductor Supply Chain (STRUCTURAL)</w:t>
@@ -4086,7 +3815,6 @@
           <w:p>
             <w:pPr>
               <w:pStyle w:val="Compact"/>
-              <w:jc w:val="left"/>
             </w:pPr>
             <w:r>
               <w:t xml:space="preserve">Not a showstopper: Semiconductors at the edges only. Supply chain disruption degrades endpoints; backbone continues.</w:t>
@@ -4098,7 +3826,6 @@
           <w:p>
             <w:pPr>
               <w:pStyle w:val="Compact"/>
-              <w:jc w:val="left"/>
             </w:pPr>
             <w:r>
               <w:t xml:space="preserve">STRUCTURAL SHOWSTOPPER: Total semiconductor dependency at every backbone node. Manufactured by 5–8 companies worldwide. No country in sub-Saharan Africa manufactures power semiconductors. No realistic path to local manufacturing (requires billions in capital, cleanroom fabs, specialty gases, trained process engineers). Failed SSTs and SSCBs cannot be fabricated from locally available materials. This dependency is permanent and irreducible.</w:t>
@@ -4112,7 +3839,6 @@
           <w:p>
             <w:pPr>
               <w:pStyle w:val="Compact"/>
-              <w:jc w:val="left"/>
             </w:pPr>
             <w:r>
               <w:t xml:space="preserve">Workforce (STRUCTURAL)</w:t>
@@ -4124,7 +3850,6 @@
           <w:p>
             <w:pPr>
               <w:pStyle w:val="Compact"/>
-              <w:jc w:val="left"/>
             </w:pPr>
             <w:r>
               <w:t xml:space="preserve">Manageable: Trade-skilled labor pool. Transformer winding: 3–6 months training. Installation: 2 weeks. Electrician-to-engineer ratio: ~500:1.</w:t>
@@ -4136,7 +3861,6 @@
           <w:p>
             <w:pPr>
               <w:pStyle w:val="Compact"/>
-              <w:jc w:val="left"/>
             </w:pPr>
             <w:r>
               <w:t xml:space="preserve">STRUCTURAL SHOWSTOPPER: Requires university-educated power electronics engineers (6+ years). Extremely scarce in sub-Saharan Africa. High emigration rates. Cannot be solved on any timeline shorter than a decade.</w:t>
@@ -4150,7 +3874,6 @@
           <w:p>
             <w:pPr>
               <w:pStyle w:val="Compact"/>
-              <w:jc w:val="left"/>
             </w:pPr>
             <w:r>
               <w:t xml:space="preserve">Deployment Speed (STRUCTURAL)</w:t>
@@ -4162,7 +3885,6 @@
           <w:p>
             <w:pPr>
               <w:pStyle w:val="Compact"/>
-              <w:jc w:val="left"/>
             </w:pPr>
             <w:r>
               <w:t xml:space="preserve">Moderate risk: First-article design adds 6–12 months. Then 200 crews install 10,000 points in 6 months. Scales linearly with crews.</w:t>
@@ -4174,7 +3896,6 @@
           <w:p>
             <w:pPr>
               <w:pStyle w:val="Compact"/>
-              <w:jc w:val="left"/>
             </w:pPr>
             <w:r>
               <w:t xml:space="preserve">STRUCTURAL SHOWSTOPPER: 5–10 years national deployment. Bottleneck is engineer availability, not budget. 50 engineers × 10,000 stations × 1–2 weeks = 4–8 years for commissioning alone. Cannot be compressed by spending more money.</w:t>
@@ -4188,7 +3909,6 @@
           <w:p>
             <w:pPr>
               <w:pStyle w:val="Compact"/>
-              <w:jc w:val="left"/>
             </w:pPr>
             <w:r>
               <w:t xml:space="preserve">Transformer Weight</w:t>
@@ -4200,7 +3920,6 @@
           <w:p>
             <w:pPr>
               <w:pStyle w:val="Compact"/>
-              <w:jc w:val="left"/>
             </w:pPr>
             <w:r>
               <w:t xml:space="preserve">Significant disadvantage: 12 Hz mild steel transformers are 3–5x the weight of 50 Hz GOES equivalents. Manageable at distribution class (donkey-portable in pieces). Challenging at transmission class (50–200+ tonnes). Increases transport and civil works cost but does not prevent deployment.</w:t>
@@ -4212,7 +3931,6 @@
           <w:p>
             <w:pPr>
               <w:pStyle w:val="Compact"/>
-              <w:jc w:val="left"/>
             </w:pPr>
             <w:r>
               <w:t xml:space="preserve">SSTs are compact at low power. At grid scale, comparable footprint to transformer substations plus climate-controlled enclosures.</w:t>
@@ -4226,7 +3944,6 @@
           <w:p>
             <w:pPr>
               <w:pStyle w:val="Compact"/>
-              <w:jc w:val="left"/>
             </w:pPr>
             <w:r>
               <w:t xml:space="preserve">Legacy Motor Compatibility</w:t>
@@ -4238,7 +3955,6 @@
           <w:p>
             <w:pPr>
               <w:pStyle w:val="Compact"/>
-              <w:jc w:val="left"/>
             </w:pPr>
             <w:r>
               <w:t xml:space="preserve">Showstopper for retrofit only: 50/60 Hz induction motors are unusable at 12 Hz without VFDs. Irrelevant for new-build in unelectrified regions.</w:t>
@@ -4250,7 +3966,6 @@
           <w:p>
             <w:pPr>
               <w:pStyle w:val="Compact"/>
-              <w:jc w:val="left"/>
             </w:pPr>
             <w:r>
               <w:t xml:space="preserve">Moderate: Existing AC appliances require rectifiers or replacement. Typically proposed for new-build only.</w:t>
@@ -4336,25 +4051,7 @@
         <w:pStyle w:val="BodyText"/>
       </w:pPr>
       <w:r>
-        <w:t xml:space="preserve">The argument that</w:t>
-      </w:r>
-      <w:r>
-        <w:t xml:space="preserve"> </w:t>
-      </w:r>
-      <w:r>
-        <w:t xml:space="preserve">“</w:t>
-      </w:r>
-      <w:r>
-        <w:t xml:space="preserve">the semiconductor supply chain will never go offline</w:t>
-      </w:r>
-      <w:r>
-        <w:t xml:space="preserve">”</w:t>
-      </w:r>
-      <w:r>
-        <w:t xml:space="preserve"> </w:t>
-      </w:r>
-      <w:r>
-        <w:t xml:space="preserve">is the argument of someone who lives in a country that manufactures semiconductors, or that has guaranteed access through alliance structures. That argument looks different from Lusaka when Kariba is dry and the SST replacement module is on backorder because a data center in Virginia got priority allocation. It looks different from Kampala when the SST at the road junction has failed and the replacement is 12 months out from Shenzhen. It looks different from Tehran when the entity list expands and Infineon stops shipping.</w:t>
+        <w:t xml:space="preserve">The argument that “the semiconductor supply chain will never go offline” is the argument of someone who lives in a country that manufactures semiconductors, or that has guaranteed access through alliance structures. That argument looks different from Lusaka when Kariba is dry and the SST replacement module is on backorder because a data center in Virginia got priority allocation. It looks different from Kampala when the SST at the road junction has failed and the replacement is 12 months out from Shenzhen. It looks different from Tehran when the entity list expands and Infineon stops shipping.</w:t>
       </w:r>
     </w:p>
     <w:p>
@@ -4371,8 +4068,8 @@
       </w:pPr>
       <w:r>
         <w:rPr>
+          <w:b/>
           <w:bCs/>
-          <w:b/>
         </w:rPr>
         <w:t xml:space="preserve">END OF TECHNICAL ANNEX</w:t>
       </w:r>
@@ -4408,14 +4105,14 @@
 <file path=word/numbering.xml><?xml version="1.0" encoding="utf-8"?>
 <w:numbering xmlns:w="http://schemas.openxmlformats.org/wordprocessingml/2006/main">
   <w:abstractNum w:abstractNumId="990">
-    <w:nsid w:val="A990"/>
+    <w:nsid w:val="0000A990"/>
     <w:multiLevelType w:val="multilevel"/>
     <w:lvl w:ilvl="0">
       <w:numFmt w:val="bullet"/>
       <w:lvlText w:val=" "/>
       <w:lvlJc w:val="left"/>
       <w:pPr>
-        <w:ind w:left="720" w:hanging="480"/>
+        <w:ind w:left="720" w:hanging="360"/>
       </w:pPr>
     </w:lvl>
     <w:lvl w:ilvl="1">
@@ -4423,7 +4120,7 @@
       <w:lvlText w:val=" "/>
       <w:lvlJc w:val="left"/>
       <w:pPr>
-        <w:ind w:left="1440" w:hanging="480"/>
+        <w:ind w:left="1440" w:hanging="360"/>
       </w:pPr>
     </w:lvl>
     <w:lvl w:ilvl="2">
@@ -4431,7 +4128,7 @@
       <w:lvlText w:val=" "/>
       <w:lvlJc w:val="left"/>
       <w:pPr>
-        <w:ind w:left="2160" w:hanging="480"/>
+        <w:ind w:left="2160" w:hanging="360"/>
       </w:pPr>
     </w:lvl>
     <w:lvl w:ilvl="3">
@@ -4439,7 +4136,7 @@
       <w:lvlText w:val=" "/>
       <w:lvlJc w:val="left"/>
       <w:pPr>
-        <w:ind w:left="2880" w:hanging="480"/>
+        <w:ind w:left="2880" w:hanging="360"/>
       </w:pPr>
     </w:lvl>
     <w:lvl w:ilvl="4">
@@ -4447,7 +4144,7 @@
       <w:lvlText w:val=" "/>
       <w:lvlJc w:val="left"/>
       <w:pPr>
-        <w:ind w:left="3600" w:hanging="480"/>
+        <w:ind w:left="3600" w:hanging="360"/>
       </w:pPr>
     </w:lvl>
     <w:lvl w:ilvl="5">
@@ -4455,7 +4152,7 @@
       <w:lvlText w:val=" "/>
       <w:lvlJc w:val="left"/>
       <w:pPr>
-        <w:ind w:left="4320" w:hanging="480"/>
+        <w:ind w:left="4320" w:hanging="360"/>
       </w:pPr>
     </w:lvl>
     <w:lvl w:ilvl="6">
@@ -4463,7 +4160,7 @@
       <w:lvlText w:val=" "/>
       <w:lvlJc w:val="left"/>
       <w:pPr>
-        <w:ind w:left="5040" w:hanging="480"/>
+        <w:ind w:left="5040" w:hanging="360"/>
       </w:pPr>
     </w:lvl>
     <w:lvl w:ilvl="7">
@@ -4471,7 +4168,7 @@
       <w:lvlText w:val=" "/>
       <w:lvlJc w:val="left"/>
       <w:pPr>
-        <w:ind w:left="5760" w:hanging="480"/>
+        <w:ind w:left="5760" w:hanging="360"/>
       </w:pPr>
     </w:lvl>
     <w:lvl w:ilvl="8">
@@ -4479,7 +4176,7 @@
       <w:lvlText w:val=" "/>
       <w:lvlJc w:val="left"/>
       <w:pPr>
-        <w:ind w:left="6480" w:hanging="480"/>
+        <w:ind w:left="6480" w:hanging="360"/>
       </w:pPr>
     </w:lvl>
   </w:abstractNum>
@@ -4998,8 +4695,8 @@
     <w:name w:val="KeywordTok"/>
     <w:basedOn w:val="VerbatimChar"/>
     <w:rPr>
+      <w:b/>
       <w:color w:val="007020"/>
-      <w:b/>
     </w:rPr>
   </w:style>
   <w:style w:type="character" w:customStyle="1" w:styleId="DataTypeTok">
@@ -5076,42 +4773,42 @@
     <w:name w:val="ImportTok"/>
     <w:basedOn w:val="VerbatimChar"/>
     <w:rPr>
+      <w:b/>
       <w:color w:val="008000"/>
-      <w:b/>
     </w:rPr>
   </w:style>
   <w:style w:type="character" w:customStyle="1" w:styleId="CommentTok">
     <w:name w:val="CommentTok"/>
     <w:basedOn w:val="VerbatimChar"/>
     <w:rPr>
+      <w:i/>
       <w:color w:val="60a0b0"/>
-      <w:i/>
     </w:rPr>
   </w:style>
   <w:style w:type="character" w:customStyle="1" w:styleId="DocumentationTok">
     <w:name w:val="DocumentationTok"/>
     <w:basedOn w:val="VerbatimChar"/>
     <w:rPr>
+      <w:i/>
       <w:color w:val="ba2121"/>
-      <w:i/>
     </w:rPr>
   </w:style>
   <w:style w:type="character" w:customStyle="1" w:styleId="AnnotationTok">
     <w:name w:val="AnnotationTok"/>
     <w:basedOn w:val="VerbatimChar"/>
     <w:rPr>
-      <w:color w:val="60a0b0"/>
       <w:b/>
       <w:i/>
+      <w:color w:val="60a0b0"/>
     </w:rPr>
   </w:style>
   <w:style w:type="character" w:customStyle="1" w:styleId="CommentVarTok">
     <w:name w:val="CommentVarTok"/>
     <w:basedOn w:val="VerbatimChar"/>
     <w:rPr>
-      <w:color w:val="60a0b0"/>
       <w:b/>
       <w:i/>
+      <w:color w:val="60a0b0"/>
     </w:rPr>
   </w:style>
   <w:style w:type="character" w:customStyle="1" w:styleId="OtherTok">
@@ -5139,8 +4836,8 @@
     <w:name w:val="ControlFlowTok"/>
     <w:basedOn w:val="VerbatimChar"/>
     <w:rPr>
+      <w:b/>
       <w:color w:val="007020"/>
-      <w:b/>
     </w:rPr>
   </w:style>
   <w:style w:type="character" w:customStyle="1" w:styleId="OperatorTok">
@@ -5185,34 +4882,34 @@
     <w:name w:val="InformationTok"/>
     <w:basedOn w:val="VerbatimChar"/>
     <w:rPr>
-      <w:color w:val="60a0b0"/>
       <w:b/>
       <w:i/>
+      <w:color w:val="60a0b0"/>
     </w:rPr>
   </w:style>
   <w:style w:type="character" w:customStyle="1" w:styleId="WarningTok">
     <w:name w:val="WarningTok"/>
     <w:basedOn w:val="VerbatimChar"/>
     <w:rPr>
-      <w:color w:val="60a0b0"/>
       <w:b/>
       <w:i/>
+      <w:color w:val="60a0b0"/>
     </w:rPr>
   </w:style>
   <w:style w:type="character" w:customStyle="1" w:styleId="AlertTok">
     <w:name w:val="AlertTok"/>
     <w:basedOn w:val="VerbatimChar"/>
     <w:rPr>
+      <w:b/>
       <w:color w:val="ff0000"/>
-      <w:b/>
     </w:rPr>
   </w:style>
   <w:style w:type="character" w:customStyle="1" w:styleId="ErrorTok">
     <w:name w:val="ErrorTok"/>
     <w:basedOn w:val="VerbatimChar"/>
     <w:rPr>
+      <w:b/>
       <w:color w:val="ff0000"/>
-      <w:b/>
     </w:rPr>
   </w:style>
   <w:style w:type="character" w:customStyle="1" w:styleId="NormalTok">

</xml_diff>